<commit_message>
Complete AI release notes capstone project: - Added Release Note Publisher skill - Added publish command - Updated workflow documentation - Added workflow diagram - Added demo video - Updated presentation - Added generated release notes, review report, Word and HTML outputs
</commit_message>
<xml_diff>
--- a/sample-data/release-notes.docx
+++ b/sample-data/release-notes.docx
@@ -4,58 +4,35 @@
   <w:body>
     <w:p>
       <w:pPr>
-        <w:pStyle w:val="Title"/>
         <w:jc w:val="left"/>
       </w:pPr>
       <w:r>
         <w:rPr>
-          <w:rFonts w:ascii="Cambria" w:hAnsi="Cambria"/>
+          <w:rFonts w:ascii="Cambria" w:hAnsi="Cambria" w:eastAsia="Cambria"/>
           <w:b/>
           <w:color w:val="000000"/>
           <w:sz w:val="40"/>
         </w:rPr>
-        <w:t>Release notes — version 14.1</w:t>
+        <w:t>Release Notes</w:t>
       </w:r>
     </w:p>
     <w:p>
       <w:pPr>
+        <w:spacing w:after="40"/>
         <w:jc w:val="left"/>
       </w:pPr>
       <w:r>
         <w:rPr>
-          <w:rFonts w:ascii="Cambria" w:hAnsi="Cambria"/>
+          <w:rFonts w:ascii="Cambria" w:hAnsi="Cambria" w:eastAsia="Cambria"/>
           <w:b/>
           <w:color w:val="000000"/>
           <w:sz w:val="22"/>
         </w:rPr>
-        <w:t xml:space="preserve">Product: </w:t>
+        <w:t xml:space="preserve">Release Version: </w:t>
       </w:r>
       <w:r>
         <w:rPr>
-          <w:rFonts w:ascii="Cambria" w:hAnsi="Cambria"/>
-          <w:b w:val="0"/>
-          <w:color w:val="000000"/>
-          <w:sz w:val="22"/>
-        </w:rPr>
-        <w:t>Business Loan</w:t>
-      </w:r>
-    </w:p>
-    <w:p>
-      <w:pPr>
-        <w:jc w:val="left"/>
-      </w:pPr>
-      <w:r>
-        <w:rPr>
-          <w:rFonts w:ascii="Cambria" w:hAnsi="Cambria"/>
-          <w:b/>
-          <w:color w:val="000000"/>
-          <w:sz w:val="22"/>
-        </w:rPr>
-        <w:t xml:space="preserve">Release version: </w:t>
-      </w:r>
-      <w:r>
-        <w:rPr>
-          <w:rFonts w:ascii="Cambria" w:hAnsi="Cambria"/>
+          <w:rFonts w:ascii="Cambria" w:hAnsi="Cambria" w:eastAsia="Cambria"/>
           <w:b w:val="0"/>
           <w:color w:val="000000"/>
           <w:sz w:val="22"/>
@@ -69,31 +46,7 @@
       </w:pPr>
       <w:r>
         <w:rPr>
-          <w:rFonts w:ascii="Cambria" w:hAnsi="Cambria"/>
-          <w:b/>
-          <w:color w:val="000000"/>
-          <w:sz w:val="22"/>
-        </w:rPr>
-        <w:t xml:space="preserve">Release date: </w:t>
-      </w:r>
-      <w:r>
-        <w:rPr>
-          <w:rFonts w:ascii="Cambria" w:hAnsi="Cambria"/>
-          <w:b w:val="0"/>
-          <w:color w:val="000000"/>
-          <w:sz w:val="22"/>
-        </w:rPr>
-        <w:t>3 July 2026</w:t>
-      </w:r>
-    </w:p>
-    <w:p>
-      <w:pPr>
-        <w:pStyle w:val="Heading2"/>
-        <w:jc w:val="left"/>
-      </w:pPr>
-      <w:r>
-        <w:rPr>
-          <w:rFonts w:ascii="Cambria" w:hAnsi="Cambria"/>
+          <w:rFonts w:ascii="Cambria" w:hAnsi="Cambria" w:eastAsia="Cambria"/>
           <w:b/>
           <w:color w:val="000000"/>
           <w:sz w:val="32"/>
@@ -107,37 +60,99 @@
       </w:pPr>
       <w:r>
         <w:rPr>
-          <w:rFonts w:ascii="Cambria" w:hAnsi="Cambria"/>
+          <w:rFonts w:ascii="Cambria" w:hAnsi="Cambria" w:eastAsia="Cambria"/>
           <w:b w:val="0"/>
           <w:color w:val="000000"/>
           <w:sz w:val="22"/>
         </w:rPr>
-        <w:t>Release 14.1 focuses on faster customer onboarding, more reliable transaction processing, and continued regulatory compliance. This update introduces bulk customer onboarding, strengthens safeguards against duplicate transactions, and refreshes regulatory reporting to align with the latest standards. Together, these changes help teams work more efficiently while maintaining accuracy and compliance.</w:t>
+        <w:t>Release 14.1 focuses on faster customer onboarding, smarter loan decisioning, and a more reliable, uninterrupted user experience. This update introduces bulk customer onboarding and a configurable loan eligibility engine, while resolving issues around duplicate transactions and unexpected session timeouts. Together, these changes help teams work more efficiently and with greater confidence in day-to-day operations.</w:t>
       </w:r>
     </w:p>
     <w:p>
       <w:pPr>
-        <w:pStyle w:val="Heading2"/>
         <w:jc w:val="left"/>
       </w:pPr>
       <w:r>
         <w:rPr>
-          <w:rFonts w:ascii="Cambria" w:hAnsi="Cambria"/>
+          <w:rFonts w:ascii="Cambria" w:hAnsi="Cambria" w:eastAsia="Cambria"/>
           <w:b/>
           <w:color w:val="000000"/>
           <w:sz w:val="32"/>
         </w:rPr>
-        <w:t>New features</w:t>
+        <w:t>New Features</w:t>
       </w:r>
     </w:p>
     <w:p>
       <w:pPr>
-        <w:ind w:left="360" w:hanging="240"/>
         <w:jc w:val="left"/>
       </w:pPr>
       <w:r>
         <w:rPr>
-          <w:rFonts w:ascii="Cambria" w:hAnsi="Cambria"/>
+          <w:rFonts w:ascii="Cambria" w:hAnsi="Cambria" w:eastAsia="Cambria"/>
+          <w:b/>
+          <w:color w:val="000000"/>
+          <w:sz w:val="24"/>
+        </w:rPr>
+        <w:t>Bulk Customer Import</w:t>
+      </w:r>
+    </w:p>
+    <w:p>
+      <w:pPr>
+        <w:spacing w:after="40"/>
+        <w:jc w:val="left"/>
+      </w:pPr>
+      <w:r>
+        <w:rPr>
+          <w:rFonts w:ascii="Cambria" w:hAnsi="Cambria" w:eastAsia="Cambria"/>
+          <w:b/>
+          <w:color w:val="000000"/>
+          <w:sz w:val="22"/>
+        </w:rPr>
+        <w:t xml:space="preserve">Product: </w:t>
+      </w:r>
+      <w:r>
+        <w:rPr>
+          <w:rFonts w:ascii="Cambria" w:hAnsi="Cambria" w:eastAsia="Cambria"/>
+          <w:b w:val="0"/>
+          <w:color w:val="000000"/>
+          <w:sz w:val="22"/>
+        </w:rPr>
+        <w:t>Business Loan</w:t>
+      </w:r>
+    </w:p>
+    <w:p>
+      <w:pPr>
+        <w:spacing w:after="40"/>
+        <w:jc w:val="left"/>
+      </w:pPr>
+      <w:r>
+        <w:rPr>
+          <w:rFonts w:ascii="Cambria" w:hAnsi="Cambria" w:eastAsia="Cambria"/>
+          <w:b/>
+          <w:color w:val="000000"/>
+          <w:sz w:val="22"/>
+        </w:rPr>
+        <w:t xml:space="preserve">Module: </w:t>
+      </w:r>
+      <w:r>
+        <w:rPr>
+          <w:rFonts w:ascii="Cambria" w:hAnsi="Cambria" w:eastAsia="Cambria"/>
+          <w:b w:val="0"/>
+          <w:color w:val="000000"/>
+          <w:sz w:val="22"/>
+        </w:rPr>
+        <w:t>Customer Details</w:t>
+      </w:r>
+    </w:p>
+    <w:p>
+      <w:pPr>
+        <w:ind w:left="360"/>
+        <w:jc w:val="left"/>
+      </w:pPr>
+      <w:r>
+        <w:rPr>
+          <w:rFonts w:ascii="Cambria" w:hAnsi="Cambria" w:eastAsia="Cambria"/>
+          <w:b w:val="0"/>
           <w:color w:val="000000"/>
           <w:sz w:val="22"/>
         </w:rPr>
@@ -145,16 +160,7 @@
       </w:r>
       <w:r>
         <w:rPr>
-          <w:rFonts w:ascii="Cambria" w:hAnsi="Cambria"/>
-          <w:b/>
-          <w:color w:val="000000"/>
-          <w:sz w:val="22"/>
-        </w:rPr>
-        <w:t xml:space="preserve">Bulk customer import. </w:t>
-      </w:r>
-      <w:r>
-        <w:rPr>
-          <w:rFonts w:ascii="Cambria" w:hAnsi="Cambria"/>
+          <w:rFonts w:ascii="Cambria" w:hAnsi="Cambria" w:eastAsia="Cambria"/>
           <w:b w:val="0"/>
           <w:color w:val="000000"/>
           <w:sz w:val="22"/>
@@ -164,12 +170,13 @@
     </w:p>
     <w:p>
       <w:pPr>
-        <w:ind w:left="360" w:hanging="240"/>
+        <w:ind w:left="360"/>
         <w:jc w:val="left"/>
       </w:pPr>
       <w:r>
         <w:rPr>
-          <w:rFonts w:ascii="Cambria" w:hAnsi="Cambria"/>
+          <w:rFonts w:ascii="Cambria" w:hAnsi="Cambria" w:eastAsia="Cambria"/>
+          <w:b w:val="0"/>
           <w:color w:val="000000"/>
           <w:sz w:val="22"/>
         </w:rPr>
@@ -177,16 +184,16 @@
       </w:r>
       <w:r>
         <w:rPr>
-          <w:rFonts w:ascii="Cambria" w:hAnsi="Cambria"/>
+          <w:rFonts w:ascii="Cambria" w:hAnsi="Cambria" w:eastAsia="Cambria"/>
           <w:b/>
           <w:color w:val="000000"/>
           <w:sz w:val="22"/>
         </w:rPr>
-        <w:t xml:space="preserve">Customer benefit: </w:t>
+        <w:t xml:space="preserve">Customer Benefit: </w:t>
       </w:r>
       <w:r>
         <w:rPr>
-          <w:rFonts w:ascii="Cambria" w:hAnsi="Cambria"/>
+          <w:rFonts w:ascii="Cambria" w:hAnsi="Cambria" w:eastAsia="Cambria"/>
           <w:b w:val="0"/>
           <w:color w:val="000000"/>
           <w:sz w:val="22"/>
@@ -196,27 +203,89 @@
     </w:p>
     <w:p>
       <w:pPr>
-        <w:pStyle w:val="Heading2"/>
         <w:jc w:val="left"/>
       </w:pPr>
       <w:r>
         <w:rPr>
-          <w:rFonts w:ascii="Cambria" w:hAnsi="Cambria"/>
+          <w:rFonts w:ascii="Cambria" w:hAnsi="Cambria" w:eastAsia="Cambria"/>
           <w:b/>
           <w:color w:val="000000"/>
           <w:sz w:val="32"/>
         </w:rPr>
-        <w:t>Bug fixes</w:t>
+        <w:t>Enhancements</w:t>
       </w:r>
     </w:p>
     <w:p>
       <w:pPr>
-        <w:ind w:left="360" w:hanging="240"/>
         <w:jc w:val="left"/>
       </w:pPr>
       <w:r>
         <w:rPr>
-          <w:rFonts w:ascii="Cambria" w:hAnsi="Cambria"/>
+          <w:rFonts w:ascii="Cambria" w:hAnsi="Cambria" w:eastAsia="Cambria"/>
+          <w:b/>
+          <w:color w:val="000000"/>
+          <w:sz w:val="24"/>
+        </w:rPr>
+        <w:t>Configurable Loan Eligibility Engine</w:t>
+      </w:r>
+    </w:p>
+    <w:p>
+      <w:pPr>
+        <w:spacing w:after="40"/>
+        <w:jc w:val="left"/>
+      </w:pPr>
+      <w:r>
+        <w:rPr>
+          <w:rFonts w:ascii="Cambria" w:hAnsi="Cambria" w:eastAsia="Cambria"/>
+          <w:b/>
+          <w:color w:val="000000"/>
+          <w:sz w:val="22"/>
+        </w:rPr>
+        <w:t xml:space="preserve">Product: </w:t>
+      </w:r>
+      <w:r>
+        <w:rPr>
+          <w:rFonts w:ascii="Cambria" w:hAnsi="Cambria" w:eastAsia="Cambria"/>
+          <w:b w:val="0"/>
+          <w:color w:val="000000"/>
+          <w:sz w:val="22"/>
+        </w:rPr>
+        <w:t>Business Loan</w:t>
+      </w:r>
+    </w:p>
+    <w:p>
+      <w:pPr>
+        <w:spacing w:after="40"/>
+        <w:jc w:val="left"/>
+      </w:pPr>
+      <w:r>
+        <w:rPr>
+          <w:rFonts w:ascii="Cambria" w:hAnsi="Cambria" w:eastAsia="Cambria"/>
+          <w:b/>
+          <w:color w:val="000000"/>
+          <w:sz w:val="22"/>
+        </w:rPr>
+        <w:t xml:space="preserve">Module: </w:t>
+      </w:r>
+      <w:r>
+        <w:rPr>
+          <w:rFonts w:ascii="Cambria" w:hAnsi="Cambria" w:eastAsia="Cambria"/>
+          <w:b w:val="0"/>
+          <w:color w:val="000000"/>
+          <w:sz w:val="22"/>
+        </w:rPr>
+        <w:t>Loan Processing</w:t>
+      </w:r>
+    </w:p>
+    <w:p>
+      <w:pPr>
+        <w:ind w:left="360"/>
+        <w:jc w:val="left"/>
+      </w:pPr>
+      <w:r>
+        <w:rPr>
+          <w:rFonts w:ascii="Cambria" w:hAnsi="Cambria" w:eastAsia="Cambria"/>
+          <w:b w:val="0"/>
           <w:color w:val="000000"/>
           <w:sz w:val="22"/>
         </w:rPr>
@@ -224,16 +293,140 @@
       </w:r>
       <w:r>
         <w:rPr>
-          <w:rFonts w:ascii="Cambria" w:hAnsi="Cambria"/>
+          <w:rFonts w:ascii="Cambria" w:hAnsi="Cambria" w:eastAsia="Cambria"/>
+          <w:b w:val="0"/>
+          <w:color w:val="000000"/>
+          <w:sz w:val="22"/>
+        </w:rPr>
+        <w:t>Loan eligibility is now determined by configurable business rules that consider factors such as income, age, credit score, and existing loans. Rules can be prioritized and adjusted to match evolving business needs.</w:t>
+      </w:r>
+    </w:p>
+    <w:p>
+      <w:pPr>
+        <w:ind w:left="360"/>
+        <w:jc w:val="left"/>
+      </w:pPr>
+      <w:r>
+        <w:rPr>
+          <w:rFonts w:ascii="Cambria" w:hAnsi="Cambria" w:eastAsia="Cambria"/>
+          <w:b w:val="0"/>
+          <w:color w:val="000000"/>
+          <w:sz w:val="22"/>
+        </w:rPr>
+        <w:t xml:space="preserve">■  </w:t>
+      </w:r>
+      <w:r>
+        <w:rPr>
+          <w:rFonts w:ascii="Cambria" w:hAnsi="Cambria" w:eastAsia="Cambria"/>
           <w:b/>
           <w:color w:val="000000"/>
           <w:sz w:val="22"/>
         </w:rPr>
-        <w:t xml:space="preserve">Duplicate transaction prevention. </w:t>
+        <w:t xml:space="preserve">Customer Benefit: </w:t>
       </w:r>
       <w:r>
         <w:rPr>
-          <w:rFonts w:ascii="Cambria" w:hAnsi="Cambria"/>
+          <w:rFonts w:ascii="Cambria" w:hAnsi="Cambria" w:eastAsia="Cambria"/>
+          <w:b w:val="0"/>
+          <w:color w:val="000000"/>
+          <w:sz w:val="22"/>
+        </w:rPr>
+        <w:t>Enables faster, more consistent loan decisions and lets the business adapt eligibility criteria without waiting on technical changes.</w:t>
+      </w:r>
+    </w:p>
+    <w:p>
+      <w:pPr>
+        <w:jc w:val="left"/>
+      </w:pPr>
+      <w:r>
+        <w:rPr>
+          <w:rFonts w:ascii="Cambria" w:hAnsi="Cambria" w:eastAsia="Cambria"/>
+          <w:b/>
+          <w:color w:val="000000"/>
+          <w:sz w:val="32"/>
+        </w:rPr>
+        <w:t>Bug Fixes</w:t>
+      </w:r>
+    </w:p>
+    <w:p>
+      <w:pPr>
+        <w:jc w:val="left"/>
+      </w:pPr>
+      <w:r>
+        <w:rPr>
+          <w:rFonts w:ascii="Cambria" w:hAnsi="Cambria" w:eastAsia="Cambria"/>
+          <w:b/>
+          <w:color w:val="000000"/>
+          <w:sz w:val="24"/>
+        </w:rPr>
+        <w:t>Duplicate Transaction Prevention</w:t>
+      </w:r>
+    </w:p>
+    <w:p>
+      <w:pPr>
+        <w:spacing w:after="40"/>
+        <w:jc w:val="left"/>
+      </w:pPr>
+      <w:r>
+        <w:rPr>
+          <w:rFonts w:ascii="Cambria" w:hAnsi="Cambria" w:eastAsia="Cambria"/>
+          <w:b/>
+          <w:color w:val="000000"/>
+          <w:sz w:val="22"/>
+        </w:rPr>
+        <w:t xml:space="preserve">Product: </w:t>
+      </w:r>
+      <w:r>
+        <w:rPr>
+          <w:rFonts w:ascii="Cambria" w:hAnsi="Cambria" w:eastAsia="Cambria"/>
+          <w:b w:val="0"/>
+          <w:color w:val="000000"/>
+          <w:sz w:val="22"/>
+        </w:rPr>
+        <w:t>Business Loan</w:t>
+      </w:r>
+    </w:p>
+    <w:p>
+      <w:pPr>
+        <w:spacing w:after="40"/>
+        <w:jc w:val="left"/>
+      </w:pPr>
+      <w:r>
+        <w:rPr>
+          <w:rFonts w:ascii="Cambria" w:hAnsi="Cambria" w:eastAsia="Cambria"/>
+          <w:b/>
+          <w:color w:val="000000"/>
+          <w:sz w:val="22"/>
+        </w:rPr>
+        <w:t xml:space="preserve">Module: </w:t>
+      </w:r>
+      <w:r>
+        <w:rPr>
+          <w:rFonts w:ascii="Cambria" w:hAnsi="Cambria" w:eastAsia="Cambria"/>
+          <w:b w:val="0"/>
+          <w:color w:val="000000"/>
+          <w:sz w:val="22"/>
+        </w:rPr>
+        <w:t>Loan Processing</w:t>
+      </w:r>
+    </w:p>
+    <w:p>
+      <w:pPr>
+        <w:ind w:left="360"/>
+        <w:jc w:val="left"/>
+      </w:pPr>
+      <w:r>
+        <w:rPr>
+          <w:rFonts w:ascii="Cambria" w:hAnsi="Cambria" w:eastAsia="Cambria"/>
+          <w:b w:val="0"/>
+          <w:color w:val="000000"/>
+          <w:sz w:val="22"/>
+        </w:rPr>
+        <w:t xml:space="preserve">■  </w:t>
+      </w:r>
+      <w:r>
+        <w:rPr>
+          <w:rFonts w:ascii="Cambria" w:hAnsi="Cambria" w:eastAsia="Cambria"/>
           <w:b w:val="0"/>
           <w:color w:val="000000"/>
           <w:sz w:val="22"/>
@@ -243,12 +436,13 @@
     </w:p>
     <w:p>
       <w:pPr>
-        <w:ind w:left="360" w:hanging="240"/>
+        <w:ind w:left="360"/>
         <w:jc w:val="left"/>
       </w:pPr>
       <w:r>
         <w:rPr>
-          <w:rFonts w:ascii="Cambria" w:hAnsi="Cambria"/>
+          <w:rFonts w:ascii="Cambria" w:hAnsi="Cambria" w:eastAsia="Cambria"/>
+          <w:b w:val="0"/>
           <w:color w:val="000000"/>
           <w:sz w:val="22"/>
         </w:rPr>
@@ -256,16 +450,16 @@
       </w:r>
       <w:r>
         <w:rPr>
-          <w:rFonts w:ascii="Cambria" w:hAnsi="Cambria"/>
+          <w:rFonts w:ascii="Cambria" w:hAnsi="Cambria" w:eastAsia="Cambria"/>
           <w:b/>
           <w:color w:val="000000"/>
           <w:sz w:val="22"/>
         </w:rPr>
-        <w:t xml:space="preserve">Customer benefit: </w:t>
+        <w:t xml:space="preserve">Customer Benefit: </w:t>
       </w:r>
       <w:r>
         <w:rPr>
-          <w:rFonts w:ascii="Cambria" w:hAnsi="Cambria"/>
+          <w:rFonts w:ascii="Cambria" w:hAnsi="Cambria" w:eastAsia="Cambria"/>
           <w:b w:val="0"/>
           <w:color w:val="000000"/>
           <w:sz w:val="22"/>
@@ -275,27 +469,75 @@
     </w:p>
     <w:p>
       <w:pPr>
-        <w:pStyle w:val="Heading2"/>
         <w:jc w:val="left"/>
       </w:pPr>
       <w:r>
         <w:rPr>
-          <w:rFonts w:ascii="Cambria" w:hAnsi="Cambria"/>
+          <w:rFonts w:ascii="Cambria" w:hAnsi="Cambria" w:eastAsia="Cambria"/>
           <w:b/>
           <w:color w:val="000000"/>
-          <w:sz w:val="32"/>
+          <w:sz w:val="24"/>
         </w:rPr>
-        <w:t>Regulatory updates</w:t>
+        <w:t>Reliable Session Handling</w:t>
       </w:r>
     </w:p>
     <w:p>
       <w:pPr>
-        <w:ind w:left="360" w:hanging="240"/>
+        <w:spacing w:after="40"/>
         <w:jc w:val="left"/>
       </w:pPr>
       <w:r>
         <w:rPr>
-          <w:rFonts w:ascii="Cambria" w:hAnsi="Cambria"/>
+          <w:rFonts w:ascii="Cambria" w:hAnsi="Cambria" w:eastAsia="Cambria"/>
+          <w:b/>
+          <w:color w:val="000000"/>
+          <w:sz w:val="22"/>
+        </w:rPr>
+        <w:t xml:space="preserve">Product: </w:t>
+      </w:r>
+      <w:r>
+        <w:rPr>
+          <w:rFonts w:ascii="Cambria" w:hAnsi="Cambria" w:eastAsia="Cambria"/>
+          <w:b w:val="0"/>
+          <w:color w:val="000000"/>
+          <w:sz w:val="22"/>
+        </w:rPr>
+        <w:t>Personal Loan</w:t>
+      </w:r>
+    </w:p>
+    <w:p>
+      <w:pPr>
+        <w:spacing w:after="40"/>
+        <w:jc w:val="left"/>
+      </w:pPr>
+      <w:r>
+        <w:rPr>
+          <w:rFonts w:ascii="Cambria" w:hAnsi="Cambria" w:eastAsia="Cambria"/>
+          <w:b/>
+          <w:color w:val="000000"/>
+          <w:sz w:val="22"/>
+        </w:rPr>
+        <w:t xml:space="preserve">Module: </w:t>
+      </w:r>
+      <w:r>
+        <w:rPr>
+          <w:rFonts w:ascii="Cambria" w:hAnsi="Cambria" w:eastAsia="Cambria"/>
+          <w:b w:val="0"/>
+          <w:color w:val="000000"/>
+          <w:sz w:val="22"/>
+        </w:rPr>
+        <w:t>Dashboard</w:t>
+      </w:r>
+    </w:p>
+    <w:p>
+      <w:pPr>
+        <w:ind w:left="360"/>
+        <w:jc w:val="left"/>
+      </w:pPr>
+      <w:r>
+        <w:rPr>
+          <w:rFonts w:ascii="Cambria" w:hAnsi="Cambria" w:eastAsia="Cambria"/>
+          <w:b w:val="0"/>
           <w:color w:val="000000"/>
           <w:sz w:val="22"/>
         </w:rPr>
@@ -303,31 +545,23 @@
       </w:r>
       <w:r>
         <w:rPr>
-          <w:rFonts w:ascii="Cambria" w:hAnsi="Cambria"/>
-          <w:b/>
-          <w:color w:val="000000"/>
-          <w:sz w:val="22"/>
-        </w:rPr>
-        <w:t xml:space="preserve">Updated regulatory reporting. </w:t>
-      </w:r>
-      <w:r>
-        <w:rPr>
-          <w:rFonts w:ascii="Cambria" w:hAnsi="Cambria"/>
+          <w:rFonts w:ascii="Cambria" w:hAnsi="Cambria" w:eastAsia="Cambria"/>
           <w:b w:val="0"/>
           <w:color w:val="000000"/>
           <w:sz w:val="22"/>
         </w:rPr>
-        <w:t>Regulatory report templates have been updated to comply with the latest reporting standards, including additional compliance information required for accurate submissions. Report generation and export have also been made faster.</w:t>
+        <w:t>Resolved an issue that caused users to be logged out unexpectedly during active sessions. Sessions now stay active during ongoing work and are maintained more reliably in the background.</w:t>
       </w:r>
     </w:p>
     <w:p>
       <w:pPr>
-        <w:ind w:left="360" w:hanging="240"/>
+        <w:ind w:left="360"/>
         <w:jc w:val="left"/>
       </w:pPr>
       <w:r>
         <w:rPr>
-          <w:rFonts w:ascii="Cambria" w:hAnsi="Cambria"/>
+          <w:rFonts w:ascii="Cambria" w:hAnsi="Cambria" w:eastAsia="Cambria"/>
+          <w:b w:val="0"/>
           <w:color w:val="000000"/>
           <w:sz w:val="22"/>
         </w:rPr>
@@ -335,36 +569,21 @@
       </w:r>
       <w:r>
         <w:rPr>
-          <w:rFonts w:ascii="Cambria" w:hAnsi="Cambria"/>
+          <w:rFonts w:ascii="Cambria" w:hAnsi="Cambria" w:eastAsia="Cambria"/>
           <w:b/>
           <w:color w:val="000000"/>
           <w:sz w:val="22"/>
         </w:rPr>
-        <w:t xml:space="preserve">Business impact: </w:t>
+        <w:t xml:space="preserve">Customer Benefit: </w:t>
       </w:r>
       <w:r>
         <w:rPr>
-          <w:rFonts w:ascii="Cambria" w:hAnsi="Cambria"/>
+          <w:rFonts w:ascii="Cambria" w:hAnsi="Cambria" w:eastAsia="Cambria"/>
           <w:b w:val="0"/>
           <w:color w:val="000000"/>
           <w:sz w:val="22"/>
         </w:rPr>
-        <w:t>Helps ensure ongoing regulatory compliance and delivers more complete, timely regulatory reports.</w:t>
-      </w:r>
-    </w:p>
-    <w:p>
-      <w:pPr>
-        <w:pStyle w:val="Heading2"/>
-        <w:jc w:val="left"/>
-      </w:pPr>
-      <w:r>
-        <w:rPr>
-          <w:rFonts w:ascii="Cambria" w:hAnsi="Cambria"/>
-          <w:b/>
-          <w:color w:val="000000"/>
-          <w:sz w:val="32"/>
-        </w:rPr>
-        <w:t>Known issues</w:t>
+        <w:t>Reduces interruptions and prevents lost work, delivering a smoother and more dependable experience.</w:t>
       </w:r>
     </w:p>
     <w:p>
@@ -373,7 +592,21 @@
       </w:pPr>
       <w:r>
         <w:rPr>
-          <w:rFonts w:ascii="Cambria" w:hAnsi="Cambria"/>
+          <w:rFonts w:ascii="Cambria" w:hAnsi="Cambria" w:eastAsia="Cambria"/>
+          <w:b/>
+          <w:color w:val="000000"/>
+          <w:sz w:val="32"/>
+        </w:rPr>
+        <w:t>Known Issues</w:t>
+      </w:r>
+    </w:p>
+    <w:p>
+      <w:pPr>
+        <w:jc w:val="left"/>
+      </w:pPr>
+      <w:r>
+        <w:rPr>
+          <w:rFonts w:ascii="Cambria" w:hAnsi="Cambria" w:eastAsia="Cambria"/>
           <w:b w:val="0"/>
           <w:color w:val="000000"/>
           <w:sz w:val="22"/>
@@ -819,11 +1052,11 @@
       <w:outlineLvl w:val="0"/>
     </w:pPr>
     <w:rPr>
-      <w:rFonts w:asciiTheme="majorHAnsi" w:eastAsiaTheme="majorEastAsia" w:hAnsiTheme="majorHAnsi" w:cstheme="majorBidi" w:ascii="Cambria" w:hAnsi="Cambria"/>
+      <w:rFonts w:asciiTheme="majorHAnsi" w:eastAsiaTheme="majorEastAsia" w:hAnsiTheme="majorHAnsi" w:cstheme="majorBidi"/>
       <w:b/>
       <w:bCs/>
-      <w:color w:val="000000"/>
-      <w:sz w:val="40"/>
+      <w:color w:val="365F91" w:themeColor="accent1" w:themeShade="BF"/>
+      <w:sz w:val="28"/>
       <w:szCs w:val="28"/>
     </w:rPr>
   </w:style>
@@ -843,11 +1076,11 @@
       <w:outlineLvl w:val="1"/>
     </w:pPr>
     <w:rPr>
-      <w:rFonts w:asciiTheme="majorHAnsi" w:eastAsiaTheme="majorEastAsia" w:hAnsiTheme="majorHAnsi" w:cstheme="majorBidi" w:ascii="Cambria" w:hAnsi="Cambria"/>
+      <w:rFonts w:asciiTheme="majorHAnsi" w:eastAsiaTheme="majorEastAsia" w:hAnsiTheme="majorHAnsi" w:cstheme="majorBidi"/>
       <w:b/>
       <w:bCs/>
-      <w:color w:val="000000"/>
-      <w:sz w:val="32"/>
+      <w:color w:val="4F81BD" w:themeColor="accent1"/>
+      <w:sz w:val="26"/>
       <w:szCs w:val="26"/>
     </w:rPr>
   </w:style>
@@ -1108,12 +1341,11 @@
       <w:contextualSpacing/>
     </w:pPr>
     <w:rPr>
-      <w:rFonts w:asciiTheme="majorHAnsi" w:eastAsiaTheme="majorEastAsia" w:hAnsiTheme="majorHAnsi" w:cstheme="majorBidi" w:ascii="Cambria" w:hAnsi="Cambria"/>
-      <w:b/>
-      <w:color w:val="000000"/>
+      <w:rFonts w:asciiTheme="majorHAnsi" w:eastAsiaTheme="majorEastAsia" w:hAnsiTheme="majorHAnsi" w:cstheme="majorBidi"/>
+      <w:color w:val="17365D" w:themeColor="text2" w:themeShade="BF"/>
       <w:spacing w:val="5"/>
       <w:kern w:val="28"/>
-      <w:sz w:val="40"/>
+      <w:sz w:val="52"/>
       <w:szCs w:val="52"/>
     </w:rPr>
   </w:style>

</xml_diff>

<commit_message>
update rrelease notes workflow assets
</commit_message>
<xml_diff>
--- a/sample-data/release-notes.docx
+++ b/sample-data/release-notes.docx
@@ -4,16 +4,176 @@
   <w:body>
     <w:p>
       <w:pPr>
+        <w:spacing w:after="240"/>
         <w:jc w:val="left"/>
       </w:pPr>
       <w:r>
         <w:rPr>
-          <w:rFonts w:ascii="Cambria" w:hAnsi="Cambria" w:eastAsia="Cambria"/>
+          <w:rFonts w:ascii="Cambria" w:hAnsi="Cambria"/>
           <w:b/>
           <w:color w:val="000000"/>
           <w:sz w:val="40"/>
         </w:rPr>
-        <w:t>Release Notes</w:t>
+        <w:t>Release 14.1 — Customer Onboarding &amp; Compliance Update</w:t>
+      </w:r>
+    </w:p>
+    <w:tbl>
+      <w:tblPr>
+        <w:tblStyle w:val="TableGrid"/>
+        <w:tblW w:type="auto" w:w="0"/>
+        <w:tblLook w:firstColumn="1" w:firstRow="1" w:lastColumn="0" w:lastRow="0" w:noHBand="0" w:noVBand="1" w:val="04A0"/>
+      </w:tblPr>
+      <w:tblGrid>
+        <w:gridCol w:w="4320"/>
+        <w:gridCol w:w="4320"/>
+      </w:tblGrid>
+      <w:tr>
+        <w:tc>
+          <w:tcPr>
+            <w:tcW w:type="dxa" w:w="4320"/>
+          </w:tcPr>
+          <w:p>
+            <w:r>
+              <w:rPr>
+                <w:rFonts w:ascii="Cambria" w:hAnsi="Cambria"/>
+                <w:b/>
+                <w:color w:val="000000"/>
+                <w:sz w:val="22"/>
+              </w:rPr>
+              <w:t>Release Version</w:t>
+            </w:r>
+          </w:p>
+        </w:tc>
+        <w:tc>
+          <w:tcPr>
+            <w:tcW w:type="dxa" w:w="4320"/>
+          </w:tcPr>
+          <w:p>
+            <w:r>
+              <w:rPr>
+                <w:rFonts w:ascii="Cambria" w:hAnsi="Cambria"/>
+                <w:b w:val="0"/>
+                <w:color w:val="000000"/>
+                <w:sz w:val="22"/>
+              </w:rPr>
+              <w:t>14.1</w:t>
+            </w:r>
+          </w:p>
+        </w:tc>
+      </w:tr>
+      <w:tr>
+        <w:tc>
+          <w:tcPr>
+            <w:tcW w:type="dxa" w:w="4320"/>
+          </w:tcPr>
+          <w:p>
+            <w:r>
+              <w:rPr>
+                <w:rFonts w:ascii="Cambria" w:hAnsi="Cambria"/>
+                <w:b/>
+                <w:color w:val="000000"/>
+                <w:sz w:val="22"/>
+              </w:rPr>
+              <w:t>Release Date</w:t>
+            </w:r>
+          </w:p>
+        </w:tc>
+        <w:tc>
+          <w:tcPr>
+            <w:tcW w:type="dxa" w:w="4320"/>
+          </w:tcPr>
+          <w:p>
+            <w:r>
+              <w:rPr>
+                <w:rFonts w:ascii="Cambria" w:hAnsi="Cambria"/>
+                <w:b w:val="0"/>
+                <w:color w:val="000000"/>
+                <w:sz w:val="22"/>
+              </w:rPr>
+              <w:t>2026-07-05</w:t>
+            </w:r>
+          </w:p>
+        </w:tc>
+      </w:tr>
+      <w:tr>
+        <w:tc>
+          <w:tcPr>
+            <w:tcW w:type="dxa" w:w="4320"/>
+          </w:tcPr>
+          <w:p>
+            <w:r>
+              <w:rPr>
+                <w:rFonts w:ascii="Cambria" w:hAnsi="Cambria"/>
+                <w:b/>
+                <w:color w:val="000000"/>
+                <w:sz w:val="22"/>
+              </w:rPr>
+              <w:t>Audience</w:t>
+            </w:r>
+          </w:p>
+        </w:tc>
+        <w:tc>
+          <w:tcPr>
+            <w:tcW w:type="dxa" w:w="4320"/>
+          </w:tcPr>
+          <w:p>
+            <w:r>
+              <w:rPr>
+                <w:rFonts w:ascii="Cambria" w:hAnsi="Cambria"/>
+                <w:b w:val="0"/>
+                <w:color w:val="000000"/>
+                <w:sz w:val="22"/>
+              </w:rPr>
+              <w:t>Customer</w:t>
+            </w:r>
+          </w:p>
+        </w:tc>
+      </w:tr>
+    </w:tbl>
+    <w:p/>
+    <w:p>
+      <w:pPr>
+        <w:spacing w:after="120"/>
+        <w:jc w:val="left"/>
+      </w:pPr>
+      <w:r>
+        <w:rPr>
+          <w:rFonts w:ascii="Cambria" w:hAnsi="Cambria"/>
+          <w:b/>
+          <w:color w:val="000000"/>
+          <w:sz w:val="32"/>
+        </w:rPr>
+        <w:t>Overview</w:t>
+      </w:r>
+    </w:p>
+    <w:p>
+      <w:pPr>
+        <w:spacing w:after="200"/>
+        <w:jc w:val="left"/>
+      </w:pPr>
+      <w:r>
+        <w:rPr>
+          <w:rFonts w:ascii="Cambria" w:hAnsi="Cambria"/>
+          <w:b w:val="0"/>
+          <w:color w:val="000000"/>
+          <w:sz w:val="22"/>
+        </w:rPr>
+        <w:t>Release 14.1 streamlines customer onboarding, strengthens the reliability of transaction processing, and keeps regulatory reporting aligned with the latest compliance requirements. Together, these changes help teams onboard customers faster, process payments with greater confidence, and stay compliant with evolving reporting standards.</w:t>
+      </w:r>
+    </w:p>
+    <w:p>
+      <w:pPr>
+        <w:spacing w:after="120"/>
+        <w:jc w:val="left"/>
+      </w:pPr>
+      <w:r>
+        <w:rPr>
+          <w:rFonts w:ascii="Cambria" w:hAnsi="Cambria"/>
+          <w:b/>
+          <w:color w:val="000000"/>
+          <w:sz w:val="32"/>
+        </w:rPr>
+        <w:t>New Features</w:t>
       </w:r>
     </w:p>
     <w:p>
@@ -23,72 +183,7 @@
       </w:pPr>
       <w:r>
         <w:rPr>
-          <w:rFonts w:ascii="Cambria" w:hAnsi="Cambria" w:eastAsia="Cambria"/>
-          <w:b/>
-          <w:color w:val="000000"/>
-          <w:sz w:val="22"/>
-        </w:rPr>
-        <w:t xml:space="preserve">Release Version: </w:t>
-      </w:r>
-      <w:r>
-        <w:rPr>
-          <w:rFonts w:ascii="Cambria" w:hAnsi="Cambria" w:eastAsia="Cambria"/>
-          <w:b w:val="0"/>
-          <w:color w:val="000000"/>
-          <w:sz w:val="22"/>
-        </w:rPr>
-        <w:t>14.1</w:t>
-      </w:r>
-    </w:p>
-    <w:p>
-      <w:pPr>
-        <w:jc w:val="left"/>
-      </w:pPr>
-      <w:r>
-        <w:rPr>
-          <w:rFonts w:ascii="Cambria" w:hAnsi="Cambria" w:eastAsia="Cambria"/>
-          <w:b/>
-          <w:color w:val="000000"/>
-          <w:sz w:val="32"/>
-        </w:rPr>
-        <w:t>Overview</w:t>
-      </w:r>
-    </w:p>
-    <w:p>
-      <w:pPr>
-        <w:jc w:val="left"/>
-      </w:pPr>
-      <w:r>
-        <w:rPr>
-          <w:rFonts w:ascii="Cambria" w:hAnsi="Cambria" w:eastAsia="Cambria"/>
-          <w:b w:val="0"/>
-          <w:color w:val="000000"/>
-          <w:sz w:val="22"/>
-        </w:rPr>
-        <w:t>Release 14.1 focuses on faster customer onboarding, smarter loan decisioning, and a more reliable, uninterrupted user experience. This update introduces bulk customer onboarding and a configurable loan eligibility engine, while resolving issues around duplicate transactions and unexpected session timeouts. Together, these changes help teams work more efficiently and with greater confidence in day-to-day operations.</w:t>
-      </w:r>
-    </w:p>
-    <w:p>
-      <w:pPr>
-        <w:jc w:val="left"/>
-      </w:pPr>
-      <w:r>
-        <w:rPr>
-          <w:rFonts w:ascii="Cambria" w:hAnsi="Cambria" w:eastAsia="Cambria"/>
-          <w:b/>
-          <w:color w:val="000000"/>
-          <w:sz w:val="32"/>
-        </w:rPr>
-        <w:t>New Features</w:t>
-      </w:r>
-    </w:p>
-    <w:p>
-      <w:pPr>
-        <w:jc w:val="left"/>
-      </w:pPr>
-      <w:r>
-        <w:rPr>
-          <w:rFonts w:ascii="Cambria" w:hAnsi="Cambria" w:eastAsia="Cambria"/>
+          <w:rFonts w:ascii="Cambria" w:hAnsi="Cambria"/>
           <w:b/>
           <w:color w:val="000000"/>
           <w:sz w:val="24"/>
@@ -99,11 +194,10 @@
     <w:p>
       <w:pPr>
         <w:spacing w:after="40"/>
-        <w:jc w:val="left"/>
       </w:pPr>
       <w:r>
         <w:rPr>
-          <w:rFonts w:ascii="Cambria" w:hAnsi="Cambria" w:eastAsia="Cambria"/>
+          <w:rFonts w:ascii="Cambria" w:hAnsi="Cambria"/>
           <w:b/>
           <w:color w:val="000000"/>
           <w:sz w:val="22"/>
@@ -112,7 +206,7 @@
       </w:r>
       <w:r>
         <w:rPr>
-          <w:rFonts w:ascii="Cambria" w:hAnsi="Cambria" w:eastAsia="Cambria"/>
+          <w:rFonts w:ascii="Cambria" w:hAnsi="Cambria"/>
           <w:b w:val="0"/>
           <w:color w:val="000000"/>
           <w:sz w:val="22"/>
@@ -123,11 +217,10 @@
     <w:p>
       <w:pPr>
         <w:spacing w:after="40"/>
-        <w:jc w:val="left"/>
       </w:pPr>
       <w:r>
         <w:rPr>
-          <w:rFonts w:ascii="Cambria" w:hAnsi="Cambria" w:eastAsia="Cambria"/>
+          <w:rFonts w:ascii="Cambria" w:hAnsi="Cambria"/>
           <w:b/>
           <w:color w:val="000000"/>
           <w:sz w:val="22"/>
@@ -136,7 +229,7 @@
       </w:r>
       <w:r>
         <w:rPr>
-          <w:rFonts w:ascii="Cambria" w:hAnsi="Cambria" w:eastAsia="Cambria"/>
+          <w:rFonts w:ascii="Cambria" w:hAnsi="Cambria"/>
           <w:b w:val="0"/>
           <w:color w:val="000000"/>
           <w:sz w:val="22"/>
@@ -146,12 +239,13 @@
     </w:p>
     <w:p>
       <w:pPr>
+        <w:spacing w:after="80"/>
         <w:ind w:left="360"/>
         <w:jc w:val="left"/>
       </w:pPr>
       <w:r>
         <w:rPr>
-          <w:rFonts w:ascii="Cambria" w:hAnsi="Cambria" w:eastAsia="Cambria"/>
+          <w:rFonts w:ascii="Cambria" w:hAnsi="Cambria"/>
           <w:b w:val="0"/>
           <w:color w:val="000000"/>
           <w:sz w:val="22"/>
@@ -160,22 +254,23 @@
       </w:r>
       <w:r>
         <w:rPr>
-          <w:rFonts w:ascii="Cambria" w:hAnsi="Cambria" w:eastAsia="Cambria"/>
+          <w:rFonts w:ascii="Cambria" w:hAnsi="Cambria"/>
           <w:b w:val="0"/>
           <w:color w:val="000000"/>
           <w:sz w:val="22"/>
         </w:rPr>
-        <w:t>Onboard multiple customers at once by uploading a single file, instead of entering records one at a time. Data is validated as it is processed, potential duplicates are flagged, and upload progress is tracked throughout.</w:t>
+        <w:t>Onboard multiple customers at once by uploading a single file, instead of entering records one at a time. Records are validated as they are processed, potential duplicates are flagged, and upload progress is tracked throughout.</w:t>
       </w:r>
     </w:p>
     <w:p>
       <w:pPr>
+        <w:spacing w:after="80"/>
         <w:ind w:left="360"/>
         <w:jc w:val="left"/>
       </w:pPr>
       <w:r>
         <w:rPr>
-          <w:rFonts w:ascii="Cambria" w:hAnsi="Cambria" w:eastAsia="Cambria"/>
+          <w:rFonts w:ascii="Cambria" w:hAnsi="Cambria"/>
           <w:b w:val="0"/>
           <w:color w:val="000000"/>
           <w:sz w:val="22"/>
@@ -184,7 +279,7 @@
       </w:r>
       <w:r>
         <w:rPr>
-          <w:rFonts w:ascii="Cambria" w:hAnsi="Cambria" w:eastAsia="Cambria"/>
+          <w:rFonts w:ascii="Cambria" w:hAnsi="Cambria"/>
           <w:b/>
           <w:color w:val="000000"/>
           <w:sz w:val="22"/>
@@ -193,7 +288,7 @@
       </w:r>
       <w:r>
         <w:rPr>
-          <w:rFonts w:ascii="Cambria" w:hAnsi="Cambria" w:eastAsia="Cambria"/>
+          <w:rFonts w:ascii="Cambria" w:hAnsi="Cambria"/>
           <w:b w:val="0"/>
           <w:color w:val="000000"/>
           <w:sz w:val="22"/>
@@ -201,32 +296,20 @@
         <w:t>Significantly reduces manual data entry and shortens onboarding time while helping ensure clean, accurate customer records.</w:t>
       </w:r>
     </w:p>
+    <w:p/>
     <w:p>
       <w:pPr>
+        <w:spacing w:after="120"/>
         <w:jc w:val="left"/>
       </w:pPr>
       <w:r>
         <w:rPr>
-          <w:rFonts w:ascii="Cambria" w:hAnsi="Cambria" w:eastAsia="Cambria"/>
+          <w:rFonts w:ascii="Cambria" w:hAnsi="Cambria"/>
           <w:b/>
           <w:color w:val="000000"/>
           <w:sz w:val="32"/>
         </w:rPr>
-        <w:t>Enhancements</w:t>
-      </w:r>
-    </w:p>
-    <w:p>
-      <w:pPr>
-        <w:jc w:val="left"/>
-      </w:pPr>
-      <w:r>
-        <w:rPr>
-          <w:rFonts w:ascii="Cambria" w:hAnsi="Cambria" w:eastAsia="Cambria"/>
-          <w:b/>
-          <w:color w:val="000000"/>
-          <w:sz w:val="24"/>
-        </w:rPr>
-        <w:t>Configurable Loan Eligibility Engine</w:t>
+        <w:t>Bug Fixes</w:t>
       </w:r>
     </w:p>
     <w:p>
@@ -236,7 +319,21 @@
       </w:pPr>
       <w:r>
         <w:rPr>
-          <w:rFonts w:ascii="Cambria" w:hAnsi="Cambria" w:eastAsia="Cambria"/>
+          <w:rFonts w:ascii="Cambria" w:hAnsi="Cambria"/>
+          <w:b/>
+          <w:color w:val="000000"/>
+          <w:sz w:val="24"/>
+        </w:rPr>
+        <w:t>Duplicate Transaction Prevention</w:t>
+      </w:r>
+    </w:p>
+    <w:p>
+      <w:pPr>
+        <w:spacing w:after="40"/>
+      </w:pPr>
+      <w:r>
+        <w:rPr>
+          <w:rFonts w:ascii="Cambria" w:hAnsi="Cambria"/>
           <w:b/>
           <w:color w:val="000000"/>
           <w:sz w:val="22"/>
@@ -245,7 +342,7 @@
       </w:r>
       <w:r>
         <w:rPr>
-          <w:rFonts w:ascii="Cambria" w:hAnsi="Cambria" w:eastAsia="Cambria"/>
+          <w:rFonts w:ascii="Cambria" w:hAnsi="Cambria"/>
           <w:b w:val="0"/>
           <w:color w:val="000000"/>
           <w:sz w:val="22"/>
@@ -256,11 +353,10 @@
     <w:p>
       <w:pPr>
         <w:spacing w:after="40"/>
-        <w:jc w:val="left"/>
       </w:pPr>
       <w:r>
         <w:rPr>
-          <w:rFonts w:ascii="Cambria" w:hAnsi="Cambria" w:eastAsia="Cambria"/>
+          <w:rFonts w:ascii="Cambria" w:hAnsi="Cambria"/>
           <w:b/>
           <w:color w:val="000000"/>
           <w:sz w:val="22"/>
@@ -269,7 +365,7 @@
       </w:r>
       <w:r>
         <w:rPr>
-          <w:rFonts w:ascii="Cambria" w:hAnsi="Cambria" w:eastAsia="Cambria"/>
+          <w:rFonts w:ascii="Cambria" w:hAnsi="Cambria"/>
           <w:b w:val="0"/>
           <w:color w:val="000000"/>
           <w:sz w:val="22"/>
@@ -279,12 +375,13 @@
     </w:p>
     <w:p>
       <w:pPr>
+        <w:spacing w:after="80"/>
         <w:ind w:left="360"/>
         <w:jc w:val="left"/>
       </w:pPr>
       <w:r>
         <w:rPr>
-          <w:rFonts w:ascii="Cambria" w:hAnsi="Cambria" w:eastAsia="Cambria"/>
+          <w:rFonts w:ascii="Cambria" w:hAnsi="Cambria"/>
           <w:b w:val="0"/>
           <w:color w:val="000000"/>
           <w:sz w:val="22"/>
@@ -293,22 +390,23 @@
       </w:r>
       <w:r>
         <w:rPr>
-          <w:rFonts w:ascii="Cambria" w:hAnsi="Cambria" w:eastAsia="Cambria"/>
+          <w:rFonts w:ascii="Cambria" w:hAnsi="Cambria"/>
           <w:b w:val="0"/>
           <w:color w:val="000000"/>
           <w:sz w:val="22"/>
         </w:rPr>
-        <w:t>Loan eligibility is now determined by configurable business rules that consider factors such as income, age, credit score, and existing loans. Rules can be prioritized and adjusted to match evolving business needs.</w:t>
+        <w:t>Resolved an issue that could allow the same transaction to be processed more than once. Each transaction is now verified before submission, and a clear message is shown when a potential duplicate is detected.</w:t>
       </w:r>
     </w:p>
     <w:p>
       <w:pPr>
+        <w:spacing w:after="80"/>
         <w:ind w:left="360"/>
         <w:jc w:val="left"/>
       </w:pPr>
       <w:r>
         <w:rPr>
-          <w:rFonts w:ascii="Cambria" w:hAnsi="Cambria" w:eastAsia="Cambria"/>
+          <w:rFonts w:ascii="Cambria" w:hAnsi="Cambria"/>
           <w:b w:val="0"/>
           <w:color w:val="000000"/>
           <w:sz w:val="22"/>
@@ -317,7 +415,7 @@
       </w:r>
       <w:r>
         <w:rPr>
-          <w:rFonts w:ascii="Cambria" w:hAnsi="Cambria" w:eastAsia="Cambria"/>
+          <w:rFonts w:ascii="Cambria" w:hAnsi="Cambria"/>
           <w:b/>
           <w:color w:val="000000"/>
           <w:sz w:val="22"/>
@@ -326,40 +424,28 @@
       </w:r>
       <w:r>
         <w:rPr>
-          <w:rFonts w:ascii="Cambria" w:hAnsi="Cambria" w:eastAsia="Cambria"/>
+          <w:rFonts w:ascii="Cambria" w:hAnsi="Cambria"/>
           <w:b w:val="0"/>
           <w:color w:val="000000"/>
           <w:sz w:val="22"/>
         </w:rPr>
-        <w:t>Enables faster, more consistent loan decisions and lets the business adapt eligibility criteria without waiting on technical changes.</w:t>
+        <w:t>Prevents unintended duplicate payments and improves the accuracy and reliability of transaction processing.</w:t>
       </w:r>
     </w:p>
+    <w:p/>
     <w:p>
       <w:pPr>
+        <w:spacing w:after="120"/>
         <w:jc w:val="left"/>
       </w:pPr>
       <w:r>
         <w:rPr>
-          <w:rFonts w:ascii="Cambria" w:hAnsi="Cambria" w:eastAsia="Cambria"/>
+          <w:rFonts w:ascii="Cambria" w:hAnsi="Cambria"/>
           <w:b/>
           <w:color w:val="000000"/>
           <w:sz w:val="32"/>
         </w:rPr>
-        <w:t>Bug Fixes</w:t>
-      </w:r>
-    </w:p>
-    <w:p>
-      <w:pPr>
-        <w:jc w:val="left"/>
-      </w:pPr>
-      <w:r>
-        <w:rPr>
-          <w:rFonts w:ascii="Cambria" w:hAnsi="Cambria" w:eastAsia="Cambria"/>
-          <w:b/>
-          <w:color w:val="000000"/>
-          <w:sz w:val="24"/>
-        </w:rPr>
-        <w:t>Duplicate Transaction Prevention</w:t>
+        <w:t>Regulatory Updates</w:t>
       </w:r>
     </w:p>
     <w:p>
@@ -369,31 +455,21 @@
       </w:pPr>
       <w:r>
         <w:rPr>
-          <w:rFonts w:ascii="Cambria" w:hAnsi="Cambria" w:eastAsia="Cambria"/>
+          <w:rFonts w:ascii="Cambria" w:hAnsi="Cambria"/>
           <w:b/>
           <w:color w:val="000000"/>
-          <w:sz w:val="22"/>
+          <w:sz w:val="24"/>
         </w:rPr>
-        <w:t xml:space="preserve">Product: </w:t>
-      </w:r>
-      <w:r>
-        <w:rPr>
-          <w:rFonts w:ascii="Cambria" w:hAnsi="Cambria" w:eastAsia="Cambria"/>
-          <w:b w:val="0"/>
-          <w:color w:val="000000"/>
-          <w:sz w:val="22"/>
-        </w:rPr>
-        <w:t>Business Loan</w:t>
+        <w:t>Updated Regulatory Report Templates</w:t>
       </w:r>
     </w:p>
     <w:p>
       <w:pPr>
         <w:spacing w:after="40"/>
-        <w:jc w:val="left"/>
       </w:pPr>
       <w:r>
         <w:rPr>
-          <w:rFonts w:ascii="Cambria" w:hAnsi="Cambria" w:eastAsia="Cambria"/>
+          <w:rFonts w:ascii="Cambria" w:hAnsi="Cambria"/>
           <w:b/>
           <w:color w:val="000000"/>
           <w:sz w:val="22"/>
@@ -402,22 +478,23 @@
       </w:r>
       <w:r>
         <w:rPr>
-          <w:rFonts w:ascii="Cambria" w:hAnsi="Cambria" w:eastAsia="Cambria"/>
+          <w:rFonts w:ascii="Cambria" w:hAnsi="Cambria"/>
           <w:b w:val="0"/>
           <w:color w:val="000000"/>
           <w:sz w:val="22"/>
         </w:rPr>
-        <w:t>Loan Processing</w:t>
+        <w:t>Reports</w:t>
       </w:r>
     </w:p>
     <w:p>
       <w:pPr>
+        <w:spacing w:after="80"/>
         <w:ind w:left="360"/>
         <w:jc w:val="left"/>
       </w:pPr>
       <w:r>
         <w:rPr>
-          <w:rFonts w:ascii="Cambria" w:hAnsi="Cambria" w:eastAsia="Cambria"/>
+          <w:rFonts w:ascii="Cambria" w:hAnsi="Cambria"/>
           <w:b w:val="0"/>
           <w:color w:val="000000"/>
           <w:sz w:val="22"/>
@@ -426,22 +503,23 @@
       </w:r>
       <w:r>
         <w:rPr>
-          <w:rFonts w:ascii="Cambria" w:hAnsi="Cambria" w:eastAsia="Cambria"/>
+          <w:rFonts w:ascii="Cambria" w:hAnsi="Cambria"/>
           <w:b w:val="0"/>
           <w:color w:val="000000"/>
           <w:sz w:val="22"/>
         </w:rPr>
-        <w:t>Resolved an issue that could allow the same transaction to be processed more than once. Each transaction is now verified before submission, and a clear message is shown when a potential duplicate is detected.</w:t>
+        <w:t>Regulatory report templates have been updated to comply with the latest reporting standards, including new compliance information and a refreshed report layout. Report generation has also been made faster.</w:t>
       </w:r>
     </w:p>
     <w:p>
       <w:pPr>
+        <w:spacing w:after="80"/>
         <w:ind w:left="360"/>
         <w:jc w:val="left"/>
       </w:pPr>
       <w:r>
         <w:rPr>
-          <w:rFonts w:ascii="Cambria" w:hAnsi="Cambria" w:eastAsia="Cambria"/>
+          <w:rFonts w:ascii="Cambria" w:hAnsi="Cambria"/>
           <w:b w:val="0"/>
           <w:color w:val="000000"/>
           <w:sz w:val="22"/>
@@ -450,149 +528,32 @@
       </w:r>
       <w:r>
         <w:rPr>
-          <w:rFonts w:ascii="Cambria" w:hAnsi="Cambria" w:eastAsia="Cambria"/>
+          <w:rFonts w:ascii="Cambria" w:hAnsi="Cambria"/>
           <w:b/>
           <w:color w:val="000000"/>
           <w:sz w:val="22"/>
         </w:rPr>
-        <w:t xml:space="preserve">Customer Benefit: </w:t>
+        <w:t xml:space="preserve">Business Impact: </w:t>
       </w:r>
       <w:r>
         <w:rPr>
-          <w:rFonts w:ascii="Cambria" w:hAnsi="Cambria" w:eastAsia="Cambria"/>
+          <w:rFonts w:ascii="Cambria" w:hAnsi="Cambria"/>
           <w:b w:val="0"/>
           <w:color w:val="000000"/>
           <w:sz w:val="22"/>
         </w:rPr>
-        <w:t>Prevents unintended duplicate payments and improves the accuracy and reliability of transaction processing.</w:t>
+        <w:t>Helps the organization meet current regulatory requirements and produce compliant reports more efficiently.</w:t>
       </w:r>
     </w:p>
+    <w:p/>
     <w:p>
       <w:pPr>
+        <w:spacing w:after="120"/>
         <w:jc w:val="left"/>
       </w:pPr>
       <w:r>
         <w:rPr>
-          <w:rFonts w:ascii="Cambria" w:hAnsi="Cambria" w:eastAsia="Cambria"/>
-          <w:b/>
-          <w:color w:val="000000"/>
-          <w:sz w:val="24"/>
-        </w:rPr>
-        <w:t>Reliable Session Handling</w:t>
-      </w:r>
-    </w:p>
-    <w:p>
-      <w:pPr>
-        <w:spacing w:after="40"/>
-        <w:jc w:val="left"/>
-      </w:pPr>
-      <w:r>
-        <w:rPr>
-          <w:rFonts w:ascii="Cambria" w:hAnsi="Cambria" w:eastAsia="Cambria"/>
-          <w:b/>
-          <w:color w:val="000000"/>
-          <w:sz w:val="22"/>
-        </w:rPr>
-        <w:t xml:space="preserve">Product: </w:t>
-      </w:r>
-      <w:r>
-        <w:rPr>
-          <w:rFonts w:ascii="Cambria" w:hAnsi="Cambria" w:eastAsia="Cambria"/>
-          <w:b w:val="0"/>
-          <w:color w:val="000000"/>
-          <w:sz w:val="22"/>
-        </w:rPr>
-        <w:t>Personal Loan</w:t>
-      </w:r>
-    </w:p>
-    <w:p>
-      <w:pPr>
-        <w:spacing w:after="40"/>
-        <w:jc w:val="left"/>
-      </w:pPr>
-      <w:r>
-        <w:rPr>
-          <w:rFonts w:ascii="Cambria" w:hAnsi="Cambria" w:eastAsia="Cambria"/>
-          <w:b/>
-          <w:color w:val="000000"/>
-          <w:sz w:val="22"/>
-        </w:rPr>
-        <w:t xml:space="preserve">Module: </w:t>
-      </w:r>
-      <w:r>
-        <w:rPr>
-          <w:rFonts w:ascii="Cambria" w:hAnsi="Cambria" w:eastAsia="Cambria"/>
-          <w:b w:val="0"/>
-          <w:color w:val="000000"/>
-          <w:sz w:val="22"/>
-        </w:rPr>
-        <w:t>Dashboard</w:t>
-      </w:r>
-    </w:p>
-    <w:p>
-      <w:pPr>
-        <w:ind w:left="360"/>
-        <w:jc w:val="left"/>
-      </w:pPr>
-      <w:r>
-        <w:rPr>
-          <w:rFonts w:ascii="Cambria" w:hAnsi="Cambria" w:eastAsia="Cambria"/>
-          <w:b w:val="0"/>
-          <w:color w:val="000000"/>
-          <w:sz w:val="22"/>
-        </w:rPr>
-        <w:t xml:space="preserve">■  </w:t>
-      </w:r>
-      <w:r>
-        <w:rPr>
-          <w:rFonts w:ascii="Cambria" w:hAnsi="Cambria" w:eastAsia="Cambria"/>
-          <w:b w:val="0"/>
-          <w:color w:val="000000"/>
-          <w:sz w:val="22"/>
-        </w:rPr>
-        <w:t>Resolved an issue that caused users to be logged out unexpectedly during active sessions. Sessions now stay active during ongoing work and are maintained more reliably in the background.</w:t>
-      </w:r>
-    </w:p>
-    <w:p>
-      <w:pPr>
-        <w:ind w:left="360"/>
-        <w:jc w:val="left"/>
-      </w:pPr>
-      <w:r>
-        <w:rPr>
-          <w:rFonts w:ascii="Cambria" w:hAnsi="Cambria" w:eastAsia="Cambria"/>
-          <w:b w:val="0"/>
-          <w:color w:val="000000"/>
-          <w:sz w:val="22"/>
-        </w:rPr>
-        <w:t xml:space="preserve">■  </w:t>
-      </w:r>
-      <w:r>
-        <w:rPr>
-          <w:rFonts w:ascii="Cambria" w:hAnsi="Cambria" w:eastAsia="Cambria"/>
-          <w:b/>
-          <w:color w:val="000000"/>
-          <w:sz w:val="22"/>
-        </w:rPr>
-        <w:t xml:space="preserve">Customer Benefit: </w:t>
-      </w:r>
-      <w:r>
-        <w:rPr>
-          <w:rFonts w:ascii="Cambria" w:hAnsi="Cambria" w:eastAsia="Cambria"/>
-          <w:b w:val="0"/>
-          <w:color w:val="000000"/>
-          <w:sz w:val="22"/>
-        </w:rPr>
-        <w:t>Reduces interruptions and prevents lost work, delivering a smoother and more dependable experience.</w:t>
-      </w:r>
-    </w:p>
-    <w:p>
-      <w:pPr>
-        <w:jc w:val="left"/>
-      </w:pPr>
-      <w:r>
-        <w:rPr>
-          <w:rFonts w:ascii="Cambria" w:hAnsi="Cambria" w:eastAsia="Cambria"/>
+          <w:rFonts w:ascii="Cambria" w:hAnsi="Cambria"/>
           <w:b/>
           <w:color w:val="000000"/>
           <w:sz w:val="32"/>
@@ -602,11 +563,12 @@
     </w:p>
     <w:p>
       <w:pPr>
+        <w:spacing w:after="200"/>
         <w:jc w:val="left"/>
       </w:pPr>
       <w:r>
         <w:rPr>
-          <w:rFonts w:ascii="Cambria" w:hAnsi="Cambria" w:eastAsia="Cambria"/>
+          <w:rFonts w:ascii="Cambria" w:hAnsi="Cambria"/>
           <w:b w:val="0"/>
           <w:color w:val="000000"/>
           <w:sz w:val="22"/>
@@ -987,11 +949,6 @@
     <w:name w:val="Normal"/>
     <w:qFormat/>
     <w:rsid w:val="00FC693F"/>
-    <w:rPr>
-      <w:rFonts w:ascii="Cambria" w:hAnsi="Cambria" w:eastAsia="Cambria"/>
-      <w:color w:val="000000"/>
-      <w:sz w:val="22"/>
-    </w:rPr>
   </w:style>
   <w:style w:type="paragraph" w:styleId="Header">
     <w:name w:val="header"/>

</xml_diff>